<commit_message>
Added Userprofile endpoints to plan
</commit_message>
<xml_diff>
--- a/docs/New Microsoft Word Document.docx
+++ b/docs/New Microsoft Word Document.docx
@@ -25,7 +25,15 @@
       </w:r>
     </w:p>
     <w:p>
-      <w:r>
+      <w:pPr>
+        <w:rPr>
+          <w:u w:val="single"/>
+        </w:rPr>
+      </w:pPr>
+      <w:r>
+        <w:rPr>
+          <w:u w:val="single"/>
+        </w:rPr>
         <w:t>Authentication</w:t>
       </w:r>
     </w:p>
@@ -80,6 +88,89 @@
         <w:t>/auth/logout: Log out the current user.</w:t>
       </w:r>
     </w:p>
+    <w:p/>
+    <w:p>
+      <w:pPr>
+        <w:rPr>
+          <w:u w:val="single"/>
+        </w:rPr>
+      </w:pPr>
+      <w:r>
+        <w:rPr>
+          <w:u w:val="single"/>
+        </w:rPr>
+        <w:t>User Profile</w:t>
+      </w:r>
+    </w:p>
+    <w:p>
+      <w:pPr>
+        <w:numPr>
+          <w:ilvl w:val="0"/>
+          <w:numId w:val="1"/>
+        </w:numPr>
+      </w:pPr>
+      <w:r>
+        <w:rPr>
+          <w:b/>
+          <w:bCs/>
+        </w:rPr>
+        <w:t>GET /</w:t>
+      </w:r>
+      <w:proofErr w:type="spellStart"/>
+      <w:r>
+        <w:rPr>
+          <w:b/>
+          <w:bCs/>
+        </w:rPr>
+        <w:t>api</w:t>
+      </w:r>
+      <w:proofErr w:type="spellEnd"/>
+      <w:r>
+        <w:rPr>
+          <w:b/>
+          <w:bCs/>
+        </w:rPr>
+        <w:t>/users/profile</w:t>
+      </w:r>
+      <w:r>
+        <w:t>: View the logged-in user's profile.</w:t>
+      </w:r>
+    </w:p>
+    <w:p>
+      <w:pPr>
+        <w:numPr>
+          <w:ilvl w:val="0"/>
+          <w:numId w:val="1"/>
+        </w:numPr>
+      </w:pPr>
+      <w:r>
+        <w:rPr>
+          <w:b/>
+          <w:bCs/>
+        </w:rPr>
+        <w:t>PUT /</w:t>
+      </w:r>
+      <w:proofErr w:type="spellStart"/>
+      <w:r>
+        <w:rPr>
+          <w:b/>
+          <w:bCs/>
+        </w:rPr>
+        <w:t>api</w:t>
+      </w:r>
+      <w:proofErr w:type="spellEnd"/>
+      <w:r>
+        <w:rPr>
+          <w:b/>
+          <w:bCs/>
+        </w:rPr>
+        <w:t>/users/profile</w:t>
+      </w:r>
+      <w:r>
+        <w:t>: Update the logged-in user's profile.</w:t>
+      </w:r>
+    </w:p>
+    <w:p/>
     <w:sectPr>
       <w:pgSz w:w="11906" w:h="16838"/>
       <w:pgMar w:top="1440" w:right="1440" w:bottom="1440" w:left="1440" w:header="708" w:footer="708" w:gutter="0"/>
@@ -88,6 +179,163 @@
     </w:sectPr>
   </w:body>
 </w:document>
+</file>
+
+<file path=word/numbering.xml><?xml version="1.0" encoding="utf-8"?>
+<w:numbering xmlns:wpc="http://schemas.microsoft.com/office/word/2010/wordprocessingCanvas" xmlns:cx="http://schemas.microsoft.com/office/drawing/2014/chartex" xmlns:cx1="http://schemas.microsoft.com/office/drawing/2015/9/8/chartex" xmlns:cx2="http://schemas.microsoft.com/office/drawing/2015/10/21/chartex" xmlns:cx3="http://schemas.microsoft.com/office/drawing/2016/5/9/chartex" xmlns:cx4="http://schemas.microsoft.com/office/drawing/2016/5/10/chartex" xmlns:cx5="http://schemas.microsoft.com/office/drawing/2016/5/11/chartex" xmlns:cx6="http://schemas.microsoft.com/office/drawing/2016/5/12/chartex" xmlns:cx7="http://schemas.microsoft.com/office/drawing/2016/5/13/chartex" xmlns:cx8="http://schemas.microsoft.com/office/drawing/2016/5/14/chartex" xmlns:mc="http://schemas.openxmlformats.org/markup-compatibility/2006" xmlns:aink="http://schemas.microsoft.com/office/drawing/2016/ink" xmlns:am3d="http://schemas.microsoft.com/office/drawing/2017/model3d" xmlns:o="urn:schemas-microsoft-com:office:office" xmlns:oel="http://schemas.microsoft.com/office/2019/extlst" xmlns:r="http://schemas.openxmlformats.org/officeDocument/2006/relationships" xmlns:m="http://schemas.openxmlformats.org/officeDocument/2006/math" xmlns:v="urn:schemas-microsoft-com:vml" xmlns:wp14="http://schemas.microsoft.com/office/word/2010/wordprocessingDrawing" xmlns:wp="http://schemas.openxmlformats.org/drawingml/2006/wordprocessingDrawing" xmlns:w10="urn:schemas-microsoft-com:office:word" xmlns:w="http://schemas.openxmlformats.org/wordprocessingml/2006/main" xmlns:w14="http://schemas.microsoft.com/office/word/2010/wordml" xmlns:w15="http://schemas.microsoft.com/office/word/2012/wordml" xmlns:w16cex="http://schemas.microsoft.com/office/word/2018/wordml/cex" xmlns:w16cid="http://schemas.microsoft.com/office/word/2016/wordml/cid" xmlns:w16="http://schemas.microsoft.com/office/word/2018/wordml" xmlns:w16du="http://schemas.microsoft.com/office/word/2023/wordml/word16du" xmlns:w16sdtdh="http://schemas.microsoft.com/office/word/2020/wordml/sdtdatahash" xmlns:w16sdtfl="http://schemas.microsoft.com/office/word/2024/wordml/sdtformatlock" xmlns:w16se="http://schemas.microsoft.com/office/word/2015/wordml/symex" xmlns:wpg="http://schemas.microsoft.com/office/word/2010/wordprocessingGroup" xmlns:wpi="http://schemas.microsoft.com/office/word/2010/wordprocessingInk" xmlns:wne="http://schemas.microsoft.com/office/word/2006/wordml" xmlns:wps="http://schemas.microsoft.com/office/word/2010/wordprocessingShape" mc:Ignorable="w14 w15 w16se w16cid w16 w16cex w16sdtdh w16sdtfl w16du wp14">
+  <w:abstractNum w:abstractNumId="0" w15:restartNumberingAfterBreak="0">
+    <w:nsid w:val="4FAC33E8"/>
+    <w:multiLevelType w:val="multilevel"/>
+    <w:tmpl w:val="F868467E"/>
+    <w:lvl w:ilvl="0">
+      <w:start w:val="1"/>
+      <w:numFmt w:val="bullet"/>
+      <w:lvlText w:val=""/>
+      <w:lvlJc w:val="left"/>
+      <w:pPr>
+        <w:tabs>
+          <w:tab w:val="num" w:pos="720"/>
+        </w:tabs>
+        <w:ind w:left="720" w:hanging="360"/>
+      </w:pPr>
+      <w:rPr>
+        <w:rFonts w:ascii="Symbol" w:hAnsi="Symbol" w:hint="default"/>
+        <w:sz w:val="20"/>
+      </w:rPr>
+    </w:lvl>
+    <w:lvl w:ilvl="1" w:tentative="1">
+      <w:start w:val="1"/>
+      <w:numFmt w:val="bullet"/>
+      <w:lvlText w:val="o"/>
+      <w:lvlJc w:val="left"/>
+      <w:pPr>
+        <w:tabs>
+          <w:tab w:val="num" w:pos="1440"/>
+        </w:tabs>
+        <w:ind w:left="1440" w:hanging="360"/>
+      </w:pPr>
+      <w:rPr>
+        <w:rFonts w:ascii="Courier New" w:hAnsi="Courier New" w:hint="default"/>
+        <w:sz w:val="20"/>
+      </w:rPr>
+    </w:lvl>
+    <w:lvl w:ilvl="2" w:tentative="1">
+      <w:start w:val="1"/>
+      <w:numFmt w:val="bullet"/>
+      <w:lvlText w:val=""/>
+      <w:lvlJc w:val="left"/>
+      <w:pPr>
+        <w:tabs>
+          <w:tab w:val="num" w:pos="2160"/>
+        </w:tabs>
+        <w:ind w:left="2160" w:hanging="360"/>
+      </w:pPr>
+      <w:rPr>
+        <w:rFonts w:ascii="Wingdings" w:hAnsi="Wingdings" w:hint="default"/>
+        <w:sz w:val="20"/>
+      </w:rPr>
+    </w:lvl>
+    <w:lvl w:ilvl="3" w:tentative="1">
+      <w:start w:val="1"/>
+      <w:numFmt w:val="bullet"/>
+      <w:lvlText w:val=""/>
+      <w:lvlJc w:val="left"/>
+      <w:pPr>
+        <w:tabs>
+          <w:tab w:val="num" w:pos="2880"/>
+        </w:tabs>
+        <w:ind w:left="2880" w:hanging="360"/>
+      </w:pPr>
+      <w:rPr>
+        <w:rFonts w:ascii="Wingdings" w:hAnsi="Wingdings" w:hint="default"/>
+        <w:sz w:val="20"/>
+      </w:rPr>
+    </w:lvl>
+    <w:lvl w:ilvl="4" w:tentative="1">
+      <w:start w:val="1"/>
+      <w:numFmt w:val="bullet"/>
+      <w:lvlText w:val=""/>
+      <w:lvlJc w:val="left"/>
+      <w:pPr>
+        <w:tabs>
+          <w:tab w:val="num" w:pos="3600"/>
+        </w:tabs>
+        <w:ind w:left="3600" w:hanging="360"/>
+      </w:pPr>
+      <w:rPr>
+        <w:rFonts w:ascii="Wingdings" w:hAnsi="Wingdings" w:hint="default"/>
+        <w:sz w:val="20"/>
+      </w:rPr>
+    </w:lvl>
+    <w:lvl w:ilvl="5" w:tentative="1">
+      <w:start w:val="1"/>
+      <w:numFmt w:val="bullet"/>
+      <w:lvlText w:val=""/>
+      <w:lvlJc w:val="left"/>
+      <w:pPr>
+        <w:tabs>
+          <w:tab w:val="num" w:pos="4320"/>
+        </w:tabs>
+        <w:ind w:left="4320" w:hanging="360"/>
+      </w:pPr>
+      <w:rPr>
+        <w:rFonts w:ascii="Wingdings" w:hAnsi="Wingdings" w:hint="default"/>
+        <w:sz w:val="20"/>
+      </w:rPr>
+    </w:lvl>
+    <w:lvl w:ilvl="6" w:tentative="1">
+      <w:start w:val="1"/>
+      <w:numFmt w:val="bullet"/>
+      <w:lvlText w:val=""/>
+      <w:lvlJc w:val="left"/>
+      <w:pPr>
+        <w:tabs>
+          <w:tab w:val="num" w:pos="5040"/>
+        </w:tabs>
+        <w:ind w:left="5040" w:hanging="360"/>
+      </w:pPr>
+      <w:rPr>
+        <w:rFonts w:ascii="Wingdings" w:hAnsi="Wingdings" w:hint="default"/>
+        <w:sz w:val="20"/>
+      </w:rPr>
+    </w:lvl>
+    <w:lvl w:ilvl="7" w:tentative="1">
+      <w:start w:val="1"/>
+      <w:numFmt w:val="bullet"/>
+      <w:lvlText w:val=""/>
+      <w:lvlJc w:val="left"/>
+      <w:pPr>
+        <w:tabs>
+          <w:tab w:val="num" w:pos="5760"/>
+        </w:tabs>
+        <w:ind w:left="5760" w:hanging="360"/>
+      </w:pPr>
+      <w:rPr>
+        <w:rFonts w:ascii="Wingdings" w:hAnsi="Wingdings" w:hint="default"/>
+        <w:sz w:val="20"/>
+      </w:rPr>
+    </w:lvl>
+    <w:lvl w:ilvl="8" w:tentative="1">
+      <w:start w:val="1"/>
+      <w:numFmt w:val="bullet"/>
+      <w:lvlText w:val=""/>
+      <w:lvlJc w:val="left"/>
+      <w:pPr>
+        <w:tabs>
+          <w:tab w:val="num" w:pos="6480"/>
+        </w:tabs>
+        <w:ind w:left="6480" w:hanging="360"/>
+      </w:pPr>
+      <w:rPr>
+        <w:rFonts w:ascii="Wingdings" w:hAnsi="Wingdings" w:hint="default"/>
+        <w:sz w:val="20"/>
+      </w:rPr>
+    </w:lvl>
+  </w:abstractNum>
+  <w:num w:numId="1" w16cid:durableId="1635720592">
+    <w:abstractNumId w:val="0"/>
+  </w:num>
+</w:numbering>
 </file>
 
 <file path=word/styles.xml><?xml version="1.0" encoding="utf-8"?>

</xml_diff>

<commit_message>
Added Events API endpoint to plan
</commit_message>
<xml_diff>
--- a/docs/New Microsoft Word Document.docx
+++ b/docs/New Microsoft Word Document.docx
@@ -170,6 +170,238 @@
         <w:t>: Update the logged-in user's profile.</w:t>
       </w:r>
     </w:p>
+    <w:p>
+      <w:pPr>
+        <w:rPr>
+          <w:u w:val="single"/>
+        </w:rPr>
+      </w:pPr>
+      <w:r>
+        <w:rPr>
+          <w:u w:val="single"/>
+        </w:rPr>
+        <w:t>Events</w:t>
+      </w:r>
+    </w:p>
+    <w:p>
+      <w:pPr>
+        <w:numPr>
+          <w:ilvl w:val="0"/>
+          <w:numId w:val="2"/>
+        </w:numPr>
+      </w:pPr>
+      <w:r>
+        <w:rPr>
+          <w:b/>
+          <w:bCs/>
+        </w:rPr>
+        <w:t>GET /</w:t>
+      </w:r>
+      <w:proofErr w:type="spellStart"/>
+      <w:r>
+        <w:rPr>
+          <w:b/>
+          <w:bCs/>
+        </w:rPr>
+        <w:t>api</w:t>
+      </w:r>
+      <w:proofErr w:type="spellEnd"/>
+      <w:r>
+        <w:rPr>
+          <w:b/>
+          <w:bCs/>
+        </w:rPr>
+        <w:t>/events</w:t>
+      </w:r>
+      <w:r>
+        <w:t>: Retrieve a list of all events.</w:t>
+      </w:r>
+    </w:p>
+    <w:p>
+      <w:pPr>
+        <w:numPr>
+          <w:ilvl w:val="0"/>
+          <w:numId w:val="2"/>
+        </w:numPr>
+      </w:pPr>
+      <w:r>
+        <w:rPr>
+          <w:b/>
+          <w:bCs/>
+        </w:rPr>
+        <w:t>GET /</w:t>
+      </w:r>
+      <w:proofErr w:type="spellStart"/>
+      <w:r>
+        <w:rPr>
+          <w:b/>
+          <w:bCs/>
+        </w:rPr>
+        <w:t>api</w:t>
+      </w:r>
+      <w:proofErr w:type="spellEnd"/>
+      <w:r>
+        <w:rPr>
+          <w:b/>
+          <w:bCs/>
+        </w:rPr>
+        <w:t>/events/{</w:t>
+      </w:r>
+      <w:proofErr w:type="spellStart"/>
+      <w:r>
+        <w:rPr>
+          <w:b/>
+          <w:bCs/>
+        </w:rPr>
+        <w:t>event_id</w:t>
+      </w:r>
+      <w:proofErr w:type="spellEnd"/>
+      <w:r>
+        <w:rPr>
+          <w:b/>
+          <w:bCs/>
+        </w:rPr>
+        <w:t>}</w:t>
+      </w:r>
+      <w:r>
+        <w:t>: Retrieve details of a specific event.</w:t>
+      </w:r>
+    </w:p>
+    <w:p>
+      <w:pPr>
+        <w:numPr>
+          <w:ilvl w:val="0"/>
+          <w:numId w:val="2"/>
+        </w:numPr>
+      </w:pPr>
+      <w:r>
+        <w:rPr>
+          <w:b/>
+          <w:bCs/>
+        </w:rPr>
+        <w:t>POST /</w:t>
+      </w:r>
+      <w:proofErr w:type="spellStart"/>
+      <w:r>
+        <w:rPr>
+          <w:b/>
+          <w:bCs/>
+        </w:rPr>
+        <w:t>api</w:t>
+      </w:r>
+      <w:proofErr w:type="spellEnd"/>
+      <w:r>
+        <w:rPr>
+          <w:b/>
+          <w:bCs/>
+        </w:rPr>
+        <w:t>/events</w:t>
+      </w:r>
+      <w:r>
+        <w:t>: Create a new event (Organiser only).</w:t>
+      </w:r>
+    </w:p>
+    <w:p>
+      <w:pPr>
+        <w:numPr>
+          <w:ilvl w:val="0"/>
+          <w:numId w:val="2"/>
+        </w:numPr>
+      </w:pPr>
+      <w:r>
+        <w:rPr>
+          <w:b/>
+          <w:bCs/>
+        </w:rPr>
+        <w:t>PUT /</w:t>
+      </w:r>
+      <w:proofErr w:type="spellStart"/>
+      <w:r>
+        <w:rPr>
+          <w:b/>
+          <w:bCs/>
+        </w:rPr>
+        <w:t>api</w:t>
+      </w:r>
+      <w:proofErr w:type="spellEnd"/>
+      <w:r>
+        <w:rPr>
+          <w:b/>
+          <w:bCs/>
+        </w:rPr>
+        <w:t>/events/{</w:t>
+      </w:r>
+      <w:proofErr w:type="spellStart"/>
+      <w:r>
+        <w:rPr>
+          <w:b/>
+          <w:bCs/>
+        </w:rPr>
+        <w:t>event_id</w:t>
+      </w:r>
+      <w:proofErr w:type="spellEnd"/>
+      <w:r>
+        <w:rPr>
+          <w:b/>
+          <w:bCs/>
+        </w:rPr>
+        <w:t>}</w:t>
+      </w:r>
+      <w:r>
+        <w:t>: Update an existing event (Organiser only).</w:t>
+      </w:r>
+    </w:p>
+    <w:p>
+      <w:pPr>
+        <w:numPr>
+          <w:ilvl w:val="0"/>
+          <w:numId w:val="2"/>
+        </w:numPr>
+      </w:pPr>
+      <w:r>
+        <w:rPr>
+          <w:b/>
+          <w:bCs/>
+        </w:rPr>
+        <w:t>DELETE /</w:t>
+      </w:r>
+      <w:proofErr w:type="spellStart"/>
+      <w:r>
+        <w:rPr>
+          <w:b/>
+          <w:bCs/>
+        </w:rPr>
+        <w:t>api</w:t>
+      </w:r>
+      <w:proofErr w:type="spellEnd"/>
+      <w:r>
+        <w:rPr>
+          <w:b/>
+          <w:bCs/>
+        </w:rPr>
+        <w:t>/events/{</w:t>
+      </w:r>
+      <w:proofErr w:type="spellStart"/>
+      <w:r>
+        <w:rPr>
+          <w:b/>
+          <w:bCs/>
+        </w:rPr>
+        <w:t>event_id</w:t>
+      </w:r>
+      <w:proofErr w:type="spellEnd"/>
+      <w:r>
+        <w:rPr>
+          <w:b/>
+          <w:bCs/>
+        </w:rPr>
+        <w:t>}</w:t>
+      </w:r>
+      <w:r>
+        <w:t>: Delete an event (Organiser only).</w:t>
+      </w:r>
+    </w:p>
+    <w:p/>
     <w:p/>
     <w:sectPr>
       <w:pgSz w:w="11906" w:h="16838"/>
@@ -184,9 +416,9 @@
 <file path=word/numbering.xml><?xml version="1.0" encoding="utf-8"?>
 <w:numbering xmlns:wpc="http://schemas.microsoft.com/office/word/2010/wordprocessingCanvas" xmlns:cx="http://schemas.microsoft.com/office/drawing/2014/chartex" xmlns:cx1="http://schemas.microsoft.com/office/drawing/2015/9/8/chartex" xmlns:cx2="http://schemas.microsoft.com/office/drawing/2015/10/21/chartex" xmlns:cx3="http://schemas.microsoft.com/office/drawing/2016/5/9/chartex" xmlns:cx4="http://schemas.microsoft.com/office/drawing/2016/5/10/chartex" xmlns:cx5="http://schemas.microsoft.com/office/drawing/2016/5/11/chartex" xmlns:cx6="http://schemas.microsoft.com/office/drawing/2016/5/12/chartex" xmlns:cx7="http://schemas.microsoft.com/office/drawing/2016/5/13/chartex" xmlns:cx8="http://schemas.microsoft.com/office/drawing/2016/5/14/chartex" xmlns:mc="http://schemas.openxmlformats.org/markup-compatibility/2006" xmlns:aink="http://schemas.microsoft.com/office/drawing/2016/ink" xmlns:am3d="http://schemas.microsoft.com/office/drawing/2017/model3d" xmlns:o="urn:schemas-microsoft-com:office:office" xmlns:oel="http://schemas.microsoft.com/office/2019/extlst" xmlns:r="http://schemas.openxmlformats.org/officeDocument/2006/relationships" xmlns:m="http://schemas.openxmlformats.org/officeDocument/2006/math" xmlns:v="urn:schemas-microsoft-com:vml" xmlns:wp14="http://schemas.microsoft.com/office/word/2010/wordprocessingDrawing" xmlns:wp="http://schemas.openxmlformats.org/drawingml/2006/wordprocessingDrawing" xmlns:w10="urn:schemas-microsoft-com:office:word" xmlns:w="http://schemas.openxmlformats.org/wordprocessingml/2006/main" xmlns:w14="http://schemas.microsoft.com/office/word/2010/wordml" xmlns:w15="http://schemas.microsoft.com/office/word/2012/wordml" xmlns:w16cex="http://schemas.microsoft.com/office/word/2018/wordml/cex" xmlns:w16cid="http://schemas.microsoft.com/office/word/2016/wordml/cid" xmlns:w16="http://schemas.microsoft.com/office/word/2018/wordml" xmlns:w16du="http://schemas.microsoft.com/office/word/2023/wordml/word16du" xmlns:w16sdtdh="http://schemas.microsoft.com/office/word/2020/wordml/sdtdatahash" xmlns:w16sdtfl="http://schemas.microsoft.com/office/word/2024/wordml/sdtformatlock" xmlns:w16se="http://schemas.microsoft.com/office/word/2015/wordml/symex" xmlns:wpg="http://schemas.microsoft.com/office/word/2010/wordprocessingGroup" xmlns:wpi="http://schemas.microsoft.com/office/word/2010/wordprocessingInk" xmlns:wne="http://schemas.microsoft.com/office/word/2006/wordml" xmlns:wps="http://schemas.microsoft.com/office/word/2010/wordprocessingShape" mc:Ignorable="w14 w15 w16se w16cid w16 w16cex w16sdtdh w16sdtfl w16du wp14">
   <w:abstractNum w:abstractNumId="0" w15:restartNumberingAfterBreak="0">
-    <w:nsid w:val="4FAC33E8"/>
+    <w:nsid w:val="4754186B"/>
     <w:multiLevelType w:val="multilevel"/>
-    <w:tmpl w:val="F868467E"/>
+    <w:tmpl w:val="F6E08352"/>
     <w:lvl w:ilvl="0">
       <w:start w:val="1"/>
       <w:numFmt w:val="bullet"/>
@@ -332,7 +564,159 @@
       </w:rPr>
     </w:lvl>
   </w:abstractNum>
+  <w:abstractNum w:abstractNumId="1" w15:restartNumberingAfterBreak="0">
+    <w:nsid w:val="4FAC33E8"/>
+    <w:multiLevelType w:val="multilevel"/>
+    <w:tmpl w:val="F868467E"/>
+    <w:lvl w:ilvl="0">
+      <w:start w:val="1"/>
+      <w:numFmt w:val="bullet"/>
+      <w:lvlText w:val=""/>
+      <w:lvlJc w:val="left"/>
+      <w:pPr>
+        <w:tabs>
+          <w:tab w:val="num" w:pos="720"/>
+        </w:tabs>
+        <w:ind w:left="720" w:hanging="360"/>
+      </w:pPr>
+      <w:rPr>
+        <w:rFonts w:ascii="Symbol" w:hAnsi="Symbol" w:hint="default"/>
+        <w:sz w:val="20"/>
+      </w:rPr>
+    </w:lvl>
+    <w:lvl w:ilvl="1" w:tentative="1">
+      <w:start w:val="1"/>
+      <w:numFmt w:val="bullet"/>
+      <w:lvlText w:val="o"/>
+      <w:lvlJc w:val="left"/>
+      <w:pPr>
+        <w:tabs>
+          <w:tab w:val="num" w:pos="1440"/>
+        </w:tabs>
+        <w:ind w:left="1440" w:hanging="360"/>
+      </w:pPr>
+      <w:rPr>
+        <w:rFonts w:ascii="Courier New" w:hAnsi="Courier New" w:hint="default"/>
+        <w:sz w:val="20"/>
+      </w:rPr>
+    </w:lvl>
+    <w:lvl w:ilvl="2" w:tentative="1">
+      <w:start w:val="1"/>
+      <w:numFmt w:val="bullet"/>
+      <w:lvlText w:val=""/>
+      <w:lvlJc w:val="left"/>
+      <w:pPr>
+        <w:tabs>
+          <w:tab w:val="num" w:pos="2160"/>
+        </w:tabs>
+        <w:ind w:left="2160" w:hanging="360"/>
+      </w:pPr>
+      <w:rPr>
+        <w:rFonts w:ascii="Wingdings" w:hAnsi="Wingdings" w:hint="default"/>
+        <w:sz w:val="20"/>
+      </w:rPr>
+    </w:lvl>
+    <w:lvl w:ilvl="3" w:tentative="1">
+      <w:start w:val="1"/>
+      <w:numFmt w:val="bullet"/>
+      <w:lvlText w:val=""/>
+      <w:lvlJc w:val="left"/>
+      <w:pPr>
+        <w:tabs>
+          <w:tab w:val="num" w:pos="2880"/>
+        </w:tabs>
+        <w:ind w:left="2880" w:hanging="360"/>
+      </w:pPr>
+      <w:rPr>
+        <w:rFonts w:ascii="Wingdings" w:hAnsi="Wingdings" w:hint="default"/>
+        <w:sz w:val="20"/>
+      </w:rPr>
+    </w:lvl>
+    <w:lvl w:ilvl="4" w:tentative="1">
+      <w:start w:val="1"/>
+      <w:numFmt w:val="bullet"/>
+      <w:lvlText w:val=""/>
+      <w:lvlJc w:val="left"/>
+      <w:pPr>
+        <w:tabs>
+          <w:tab w:val="num" w:pos="3600"/>
+        </w:tabs>
+        <w:ind w:left="3600" w:hanging="360"/>
+      </w:pPr>
+      <w:rPr>
+        <w:rFonts w:ascii="Wingdings" w:hAnsi="Wingdings" w:hint="default"/>
+        <w:sz w:val="20"/>
+      </w:rPr>
+    </w:lvl>
+    <w:lvl w:ilvl="5" w:tentative="1">
+      <w:start w:val="1"/>
+      <w:numFmt w:val="bullet"/>
+      <w:lvlText w:val=""/>
+      <w:lvlJc w:val="left"/>
+      <w:pPr>
+        <w:tabs>
+          <w:tab w:val="num" w:pos="4320"/>
+        </w:tabs>
+        <w:ind w:left="4320" w:hanging="360"/>
+      </w:pPr>
+      <w:rPr>
+        <w:rFonts w:ascii="Wingdings" w:hAnsi="Wingdings" w:hint="default"/>
+        <w:sz w:val="20"/>
+      </w:rPr>
+    </w:lvl>
+    <w:lvl w:ilvl="6" w:tentative="1">
+      <w:start w:val="1"/>
+      <w:numFmt w:val="bullet"/>
+      <w:lvlText w:val=""/>
+      <w:lvlJc w:val="left"/>
+      <w:pPr>
+        <w:tabs>
+          <w:tab w:val="num" w:pos="5040"/>
+        </w:tabs>
+        <w:ind w:left="5040" w:hanging="360"/>
+      </w:pPr>
+      <w:rPr>
+        <w:rFonts w:ascii="Wingdings" w:hAnsi="Wingdings" w:hint="default"/>
+        <w:sz w:val="20"/>
+      </w:rPr>
+    </w:lvl>
+    <w:lvl w:ilvl="7" w:tentative="1">
+      <w:start w:val="1"/>
+      <w:numFmt w:val="bullet"/>
+      <w:lvlText w:val=""/>
+      <w:lvlJc w:val="left"/>
+      <w:pPr>
+        <w:tabs>
+          <w:tab w:val="num" w:pos="5760"/>
+        </w:tabs>
+        <w:ind w:left="5760" w:hanging="360"/>
+      </w:pPr>
+      <w:rPr>
+        <w:rFonts w:ascii="Wingdings" w:hAnsi="Wingdings" w:hint="default"/>
+        <w:sz w:val="20"/>
+      </w:rPr>
+    </w:lvl>
+    <w:lvl w:ilvl="8" w:tentative="1">
+      <w:start w:val="1"/>
+      <w:numFmt w:val="bullet"/>
+      <w:lvlText w:val=""/>
+      <w:lvlJc w:val="left"/>
+      <w:pPr>
+        <w:tabs>
+          <w:tab w:val="num" w:pos="6480"/>
+        </w:tabs>
+        <w:ind w:left="6480" w:hanging="360"/>
+      </w:pPr>
+      <w:rPr>
+        <w:rFonts w:ascii="Wingdings" w:hAnsi="Wingdings" w:hint="default"/>
+        <w:sz w:val="20"/>
+      </w:rPr>
+    </w:lvl>
+  </w:abstractNum>
   <w:num w:numId="1" w16cid:durableId="1635720592">
+    <w:abstractNumId w:val="1"/>
+  </w:num>
+  <w:num w:numId="2" w16cid:durableId="624196191">
     <w:abstractNumId w:val="0"/>
   </w:num>
 </w:numbering>

</xml_diff>

<commit_message>
added categories endpoints to API plan
</commit_message>
<xml_diff>
--- a/docs/New Microsoft Word Document.docx
+++ b/docs/New Microsoft Word Document.docx
@@ -398,10 +398,211 @@
         <w:t>}</w:t>
       </w:r>
       <w:r>
-        <w:t>: Delete an event (Organiser only).</w:t>
+        <w:t>: Delete an event (Organiser only)</w:t>
       </w:r>
     </w:p>
-    <w:p/>
+    <w:p>
+      <w:pPr>
+        <w:rPr>
+          <w:u w:val="single"/>
+        </w:rPr>
+      </w:pPr>
+      <w:r>
+        <w:rPr>
+          <w:u w:val="single"/>
+        </w:rPr>
+        <w:t>Categories</w:t>
+      </w:r>
+    </w:p>
+    <w:p>
+      <w:pPr>
+        <w:numPr>
+          <w:ilvl w:val="0"/>
+          <w:numId w:val="3"/>
+        </w:numPr>
+      </w:pPr>
+      <w:r>
+        <w:rPr>
+          <w:b/>
+          <w:bCs/>
+        </w:rPr>
+        <w:t>GET /</w:t>
+      </w:r>
+      <w:proofErr w:type="spellStart"/>
+      <w:r>
+        <w:rPr>
+          <w:b/>
+          <w:bCs/>
+        </w:rPr>
+        <w:t>api</w:t>
+      </w:r>
+      <w:proofErr w:type="spellEnd"/>
+      <w:r>
+        <w:rPr>
+          <w:b/>
+          <w:bCs/>
+        </w:rPr>
+        <w:t>/categories</w:t>
+      </w:r>
+      <w:r>
+        <w:t>: Retrieve a list of all categories.</w:t>
+      </w:r>
+    </w:p>
+    <w:p>
+      <w:pPr>
+        <w:numPr>
+          <w:ilvl w:val="0"/>
+          <w:numId w:val="3"/>
+        </w:numPr>
+      </w:pPr>
+      <w:r>
+        <w:rPr>
+          <w:b/>
+          <w:bCs/>
+        </w:rPr>
+        <w:t>POST /</w:t>
+      </w:r>
+      <w:proofErr w:type="spellStart"/>
+      <w:r>
+        <w:rPr>
+          <w:b/>
+          <w:bCs/>
+        </w:rPr>
+        <w:t>api</w:t>
+      </w:r>
+      <w:proofErr w:type="spellEnd"/>
+      <w:r>
+        <w:rPr>
+          <w:b/>
+          <w:bCs/>
+        </w:rPr>
+        <w:t>/events/{</w:t>
+      </w:r>
+      <w:proofErr w:type="spellStart"/>
+      <w:r>
+        <w:rPr>
+          <w:b/>
+          <w:bCs/>
+        </w:rPr>
+        <w:t>event_id</w:t>
+      </w:r>
+      <w:proofErr w:type="spellEnd"/>
+      <w:r>
+        <w:rPr>
+          <w:b/>
+          <w:bCs/>
+        </w:rPr>
+        <w:t>}/categories</w:t>
+      </w:r>
+      <w:r>
+        <w:t>: Create a new category for an event (Organiser only).</w:t>
+      </w:r>
+    </w:p>
+    <w:p>
+      <w:pPr>
+        <w:numPr>
+          <w:ilvl w:val="0"/>
+          <w:numId w:val="3"/>
+        </w:numPr>
+      </w:pPr>
+      <w:r>
+        <w:rPr>
+          <w:b/>
+          <w:bCs/>
+        </w:rPr>
+        <w:t>PUT /</w:t>
+      </w:r>
+      <w:proofErr w:type="spellStart"/>
+      <w:r>
+        <w:rPr>
+          <w:b/>
+          <w:bCs/>
+        </w:rPr>
+        <w:t>api</w:t>
+      </w:r>
+      <w:proofErr w:type="spellEnd"/>
+      <w:r>
+        <w:rPr>
+          <w:b/>
+          <w:bCs/>
+        </w:rPr>
+        <w:t>/categories/{</w:t>
+      </w:r>
+      <w:proofErr w:type="spellStart"/>
+      <w:r>
+        <w:rPr>
+          <w:b/>
+          <w:bCs/>
+        </w:rPr>
+        <w:t>category_id</w:t>
+      </w:r>
+      <w:proofErr w:type="spellEnd"/>
+      <w:r>
+        <w:rPr>
+          <w:b/>
+          <w:bCs/>
+        </w:rPr>
+        <w:t>}</w:t>
+      </w:r>
+      <w:r>
+        <w:t>: Update a category (Organiser only).</w:t>
+      </w:r>
+    </w:p>
+    <w:p>
+      <w:pPr>
+        <w:numPr>
+          <w:ilvl w:val="0"/>
+          <w:numId w:val="3"/>
+        </w:numPr>
+      </w:pPr>
+      <w:r>
+        <w:rPr>
+          <w:b/>
+          <w:bCs/>
+        </w:rPr>
+        <w:t>DELETE /</w:t>
+      </w:r>
+      <w:proofErr w:type="spellStart"/>
+      <w:r>
+        <w:rPr>
+          <w:b/>
+          <w:bCs/>
+        </w:rPr>
+        <w:t>api</w:t>
+      </w:r>
+      <w:proofErr w:type="spellEnd"/>
+      <w:r>
+        <w:rPr>
+          <w:b/>
+          <w:bCs/>
+        </w:rPr>
+        <w:t>/categories/{</w:t>
+      </w:r>
+      <w:proofErr w:type="spellStart"/>
+      <w:r>
+        <w:rPr>
+          <w:b/>
+          <w:bCs/>
+        </w:rPr>
+        <w:t>category_id</w:t>
+      </w:r>
+      <w:proofErr w:type="spellEnd"/>
+      <w:r>
+        <w:rPr>
+          <w:b/>
+          <w:bCs/>
+        </w:rPr>
+        <w:t>}</w:t>
+      </w:r>
+      <w:r>
+        <w:t>: Delete a category (Organiser only).</w:t>
+      </w:r>
+    </w:p>
+    <w:p>
+      <w:pPr>
+        <w:ind w:left="720"/>
+      </w:pPr>
+    </w:p>
     <w:p/>
     <w:sectPr>
       <w:pgSz w:w="11906" w:h="16838"/>
@@ -713,11 +914,163 @@
       </w:rPr>
     </w:lvl>
   </w:abstractNum>
+  <w:abstractNum w:abstractNumId="2" w15:restartNumberingAfterBreak="0">
+    <w:nsid w:val="6ED23CE7"/>
+    <w:multiLevelType w:val="multilevel"/>
+    <w:tmpl w:val="61E03DC4"/>
+    <w:lvl w:ilvl="0">
+      <w:start w:val="1"/>
+      <w:numFmt w:val="bullet"/>
+      <w:lvlText w:val=""/>
+      <w:lvlJc w:val="left"/>
+      <w:pPr>
+        <w:tabs>
+          <w:tab w:val="num" w:pos="720"/>
+        </w:tabs>
+        <w:ind w:left="720" w:hanging="360"/>
+      </w:pPr>
+      <w:rPr>
+        <w:rFonts w:ascii="Symbol" w:hAnsi="Symbol" w:hint="default"/>
+        <w:sz w:val="20"/>
+      </w:rPr>
+    </w:lvl>
+    <w:lvl w:ilvl="1" w:tentative="1">
+      <w:start w:val="1"/>
+      <w:numFmt w:val="bullet"/>
+      <w:lvlText w:val="o"/>
+      <w:lvlJc w:val="left"/>
+      <w:pPr>
+        <w:tabs>
+          <w:tab w:val="num" w:pos="1440"/>
+        </w:tabs>
+        <w:ind w:left="1440" w:hanging="360"/>
+      </w:pPr>
+      <w:rPr>
+        <w:rFonts w:ascii="Courier New" w:hAnsi="Courier New" w:hint="default"/>
+        <w:sz w:val="20"/>
+      </w:rPr>
+    </w:lvl>
+    <w:lvl w:ilvl="2" w:tentative="1">
+      <w:start w:val="1"/>
+      <w:numFmt w:val="bullet"/>
+      <w:lvlText w:val=""/>
+      <w:lvlJc w:val="left"/>
+      <w:pPr>
+        <w:tabs>
+          <w:tab w:val="num" w:pos="2160"/>
+        </w:tabs>
+        <w:ind w:left="2160" w:hanging="360"/>
+      </w:pPr>
+      <w:rPr>
+        <w:rFonts w:ascii="Wingdings" w:hAnsi="Wingdings" w:hint="default"/>
+        <w:sz w:val="20"/>
+      </w:rPr>
+    </w:lvl>
+    <w:lvl w:ilvl="3" w:tentative="1">
+      <w:start w:val="1"/>
+      <w:numFmt w:val="bullet"/>
+      <w:lvlText w:val=""/>
+      <w:lvlJc w:val="left"/>
+      <w:pPr>
+        <w:tabs>
+          <w:tab w:val="num" w:pos="2880"/>
+        </w:tabs>
+        <w:ind w:left="2880" w:hanging="360"/>
+      </w:pPr>
+      <w:rPr>
+        <w:rFonts w:ascii="Wingdings" w:hAnsi="Wingdings" w:hint="default"/>
+        <w:sz w:val="20"/>
+      </w:rPr>
+    </w:lvl>
+    <w:lvl w:ilvl="4" w:tentative="1">
+      <w:start w:val="1"/>
+      <w:numFmt w:val="bullet"/>
+      <w:lvlText w:val=""/>
+      <w:lvlJc w:val="left"/>
+      <w:pPr>
+        <w:tabs>
+          <w:tab w:val="num" w:pos="3600"/>
+        </w:tabs>
+        <w:ind w:left="3600" w:hanging="360"/>
+      </w:pPr>
+      <w:rPr>
+        <w:rFonts w:ascii="Wingdings" w:hAnsi="Wingdings" w:hint="default"/>
+        <w:sz w:val="20"/>
+      </w:rPr>
+    </w:lvl>
+    <w:lvl w:ilvl="5" w:tentative="1">
+      <w:start w:val="1"/>
+      <w:numFmt w:val="bullet"/>
+      <w:lvlText w:val=""/>
+      <w:lvlJc w:val="left"/>
+      <w:pPr>
+        <w:tabs>
+          <w:tab w:val="num" w:pos="4320"/>
+        </w:tabs>
+        <w:ind w:left="4320" w:hanging="360"/>
+      </w:pPr>
+      <w:rPr>
+        <w:rFonts w:ascii="Wingdings" w:hAnsi="Wingdings" w:hint="default"/>
+        <w:sz w:val="20"/>
+      </w:rPr>
+    </w:lvl>
+    <w:lvl w:ilvl="6" w:tentative="1">
+      <w:start w:val="1"/>
+      <w:numFmt w:val="bullet"/>
+      <w:lvlText w:val=""/>
+      <w:lvlJc w:val="left"/>
+      <w:pPr>
+        <w:tabs>
+          <w:tab w:val="num" w:pos="5040"/>
+        </w:tabs>
+        <w:ind w:left="5040" w:hanging="360"/>
+      </w:pPr>
+      <w:rPr>
+        <w:rFonts w:ascii="Wingdings" w:hAnsi="Wingdings" w:hint="default"/>
+        <w:sz w:val="20"/>
+      </w:rPr>
+    </w:lvl>
+    <w:lvl w:ilvl="7" w:tentative="1">
+      <w:start w:val="1"/>
+      <w:numFmt w:val="bullet"/>
+      <w:lvlText w:val=""/>
+      <w:lvlJc w:val="left"/>
+      <w:pPr>
+        <w:tabs>
+          <w:tab w:val="num" w:pos="5760"/>
+        </w:tabs>
+        <w:ind w:left="5760" w:hanging="360"/>
+      </w:pPr>
+      <w:rPr>
+        <w:rFonts w:ascii="Wingdings" w:hAnsi="Wingdings" w:hint="default"/>
+        <w:sz w:val="20"/>
+      </w:rPr>
+    </w:lvl>
+    <w:lvl w:ilvl="8" w:tentative="1">
+      <w:start w:val="1"/>
+      <w:numFmt w:val="bullet"/>
+      <w:lvlText w:val=""/>
+      <w:lvlJc w:val="left"/>
+      <w:pPr>
+        <w:tabs>
+          <w:tab w:val="num" w:pos="6480"/>
+        </w:tabs>
+        <w:ind w:left="6480" w:hanging="360"/>
+      </w:pPr>
+      <w:rPr>
+        <w:rFonts w:ascii="Wingdings" w:hAnsi="Wingdings" w:hint="default"/>
+        <w:sz w:val="20"/>
+      </w:rPr>
+    </w:lvl>
+  </w:abstractNum>
   <w:num w:numId="1" w16cid:durableId="1635720592">
     <w:abstractNumId w:val="1"/>
   </w:num>
   <w:num w:numId="2" w16cid:durableId="624196191">
     <w:abstractNumId w:val="0"/>
+  </w:num>
+  <w:num w:numId="3" w16cid:durableId="1770589376">
+    <w:abstractNumId w:val="2"/>
   </w:num>
 </w:numbering>
 </file>

</xml_diff>

<commit_message>
Added Enrolments Endpoint plan to API plan
</commit_message>
<xml_diff>
--- a/docs/New Microsoft Word Document.docx
+++ b/docs/New Microsoft Word Document.docx
@@ -596,6 +596,147 @@
       </w:r>
       <w:r>
         <w:t>: Delete a category (Organiser only).</w:t>
+      </w:r>
+    </w:p>
+    <w:p>
+      <w:pPr>
+        <w:rPr>
+          <w:u w:val="single"/>
+        </w:rPr>
+      </w:pPr>
+      <w:r>
+        <w:rPr>
+          <w:u w:val="single"/>
+        </w:rPr>
+        <w:t>Event Enrolments</w:t>
+      </w:r>
+    </w:p>
+    <w:p>
+      <w:pPr>
+        <w:numPr>
+          <w:ilvl w:val="0"/>
+          <w:numId w:val="4"/>
+        </w:numPr>
+      </w:pPr>
+      <w:r>
+        <w:rPr>
+          <w:b/>
+          <w:bCs/>
+        </w:rPr>
+        <w:t>POST /</w:t>
+      </w:r>
+      <w:proofErr w:type="spellStart"/>
+      <w:r>
+        <w:rPr>
+          <w:b/>
+          <w:bCs/>
+        </w:rPr>
+        <w:t>api</w:t>
+      </w:r>
+      <w:proofErr w:type="spellEnd"/>
+      <w:r>
+        <w:rPr>
+          <w:b/>
+          <w:bCs/>
+        </w:rPr>
+        <w:t>/enrolments</w:t>
+      </w:r>
+      <w:r>
+        <w:t>: Enrol a participant in an event and select a category.</w:t>
+      </w:r>
+    </w:p>
+    <w:p>
+      <w:pPr>
+        <w:numPr>
+          <w:ilvl w:val="0"/>
+          <w:numId w:val="4"/>
+        </w:numPr>
+      </w:pPr>
+      <w:r>
+        <w:rPr>
+          <w:b/>
+          <w:bCs/>
+        </w:rPr>
+        <w:t>GET /</w:t>
+      </w:r>
+      <w:proofErr w:type="spellStart"/>
+      <w:r>
+        <w:rPr>
+          <w:b/>
+          <w:bCs/>
+        </w:rPr>
+        <w:t>api</w:t>
+      </w:r>
+      <w:proofErr w:type="spellEnd"/>
+      <w:r>
+        <w:rPr>
+          <w:b/>
+          <w:bCs/>
+        </w:rPr>
+        <w:t>/enrolments</w:t>
+      </w:r>
+      <w:r>
+        <w:t>: Retrieve all enrolments for the logged-in participant.</w:t>
+      </w:r>
+    </w:p>
+    <w:p>
+      <w:pPr>
+        <w:numPr>
+          <w:ilvl w:val="0"/>
+          <w:numId w:val="4"/>
+        </w:numPr>
+      </w:pPr>
+      <w:r>
+        <w:rPr>
+          <w:b/>
+          <w:bCs/>
+        </w:rPr>
+        <w:t>GET /</w:t>
+      </w:r>
+      <w:proofErr w:type="spellStart"/>
+      <w:r>
+        <w:rPr>
+          <w:b/>
+          <w:bCs/>
+        </w:rPr>
+        <w:t>api</w:t>
+      </w:r>
+      <w:proofErr w:type="spellEnd"/>
+      <w:r>
+        <w:rPr>
+          <w:b/>
+          <w:bCs/>
+        </w:rPr>
+        <w:t>/events/{</w:t>
+      </w:r>
+      <w:proofErr w:type="spellStart"/>
+      <w:r>
+        <w:rPr>
+          <w:b/>
+          <w:bCs/>
+        </w:rPr>
+        <w:t>event_id</w:t>
+      </w:r>
+      <w:proofErr w:type="spellEnd"/>
+      <w:r>
+        <w:rPr>
+          <w:b/>
+          <w:bCs/>
+        </w:rPr>
+        <w:t>}/enrolments</w:t>
+      </w:r>
+      <w:r>
+        <w:t>: View enrolments for a specific event (Organiser only).</w:t>
+      </w:r>
+    </w:p>
+    <w:p>
+      <w:pPr>
+        <w:tabs>
+          <w:tab w:val="left" w:pos="3899"/>
+        </w:tabs>
+      </w:pPr>
+      <w:r>
+        <w:tab/>
       </w:r>
     </w:p>
     <w:p>
@@ -766,6 +907,155 @@
     </w:lvl>
   </w:abstractNum>
   <w:abstractNum w:abstractNumId="1" w15:restartNumberingAfterBreak="0">
+    <w:nsid w:val="48EC51D9"/>
+    <w:multiLevelType w:val="multilevel"/>
+    <w:tmpl w:val="5E32FC92"/>
+    <w:lvl w:ilvl="0">
+      <w:start w:val="1"/>
+      <w:numFmt w:val="bullet"/>
+      <w:lvlText w:val=""/>
+      <w:lvlJc w:val="left"/>
+      <w:pPr>
+        <w:tabs>
+          <w:tab w:val="num" w:pos="720"/>
+        </w:tabs>
+        <w:ind w:left="720" w:hanging="360"/>
+      </w:pPr>
+      <w:rPr>
+        <w:rFonts w:ascii="Symbol" w:hAnsi="Symbol" w:hint="default"/>
+        <w:sz w:val="20"/>
+      </w:rPr>
+    </w:lvl>
+    <w:lvl w:ilvl="1" w:tentative="1">
+      <w:start w:val="1"/>
+      <w:numFmt w:val="bullet"/>
+      <w:lvlText w:val="o"/>
+      <w:lvlJc w:val="left"/>
+      <w:pPr>
+        <w:tabs>
+          <w:tab w:val="num" w:pos="1440"/>
+        </w:tabs>
+        <w:ind w:left="1440" w:hanging="360"/>
+      </w:pPr>
+      <w:rPr>
+        <w:rFonts w:ascii="Courier New" w:hAnsi="Courier New" w:hint="default"/>
+        <w:sz w:val="20"/>
+      </w:rPr>
+    </w:lvl>
+    <w:lvl w:ilvl="2" w:tentative="1">
+      <w:start w:val="1"/>
+      <w:numFmt w:val="bullet"/>
+      <w:lvlText w:val=""/>
+      <w:lvlJc w:val="left"/>
+      <w:pPr>
+        <w:tabs>
+          <w:tab w:val="num" w:pos="2160"/>
+        </w:tabs>
+        <w:ind w:left="2160" w:hanging="360"/>
+      </w:pPr>
+      <w:rPr>
+        <w:rFonts w:ascii="Wingdings" w:hAnsi="Wingdings" w:hint="default"/>
+        <w:sz w:val="20"/>
+      </w:rPr>
+    </w:lvl>
+    <w:lvl w:ilvl="3" w:tentative="1">
+      <w:start w:val="1"/>
+      <w:numFmt w:val="bullet"/>
+      <w:lvlText w:val=""/>
+      <w:lvlJc w:val="left"/>
+      <w:pPr>
+        <w:tabs>
+          <w:tab w:val="num" w:pos="2880"/>
+        </w:tabs>
+        <w:ind w:left="2880" w:hanging="360"/>
+      </w:pPr>
+      <w:rPr>
+        <w:rFonts w:ascii="Wingdings" w:hAnsi="Wingdings" w:hint="default"/>
+        <w:sz w:val="20"/>
+      </w:rPr>
+    </w:lvl>
+    <w:lvl w:ilvl="4" w:tentative="1">
+      <w:start w:val="1"/>
+      <w:numFmt w:val="bullet"/>
+      <w:lvlText w:val=""/>
+      <w:lvlJc w:val="left"/>
+      <w:pPr>
+        <w:tabs>
+          <w:tab w:val="num" w:pos="3600"/>
+        </w:tabs>
+        <w:ind w:left="3600" w:hanging="360"/>
+      </w:pPr>
+      <w:rPr>
+        <w:rFonts w:ascii="Wingdings" w:hAnsi="Wingdings" w:hint="default"/>
+        <w:sz w:val="20"/>
+      </w:rPr>
+    </w:lvl>
+    <w:lvl w:ilvl="5" w:tentative="1">
+      <w:start w:val="1"/>
+      <w:numFmt w:val="bullet"/>
+      <w:lvlText w:val=""/>
+      <w:lvlJc w:val="left"/>
+      <w:pPr>
+        <w:tabs>
+          <w:tab w:val="num" w:pos="4320"/>
+        </w:tabs>
+        <w:ind w:left="4320" w:hanging="360"/>
+      </w:pPr>
+      <w:rPr>
+        <w:rFonts w:ascii="Wingdings" w:hAnsi="Wingdings" w:hint="default"/>
+        <w:sz w:val="20"/>
+      </w:rPr>
+    </w:lvl>
+    <w:lvl w:ilvl="6" w:tentative="1">
+      <w:start w:val="1"/>
+      <w:numFmt w:val="bullet"/>
+      <w:lvlText w:val=""/>
+      <w:lvlJc w:val="left"/>
+      <w:pPr>
+        <w:tabs>
+          <w:tab w:val="num" w:pos="5040"/>
+        </w:tabs>
+        <w:ind w:left="5040" w:hanging="360"/>
+      </w:pPr>
+      <w:rPr>
+        <w:rFonts w:ascii="Wingdings" w:hAnsi="Wingdings" w:hint="default"/>
+        <w:sz w:val="20"/>
+      </w:rPr>
+    </w:lvl>
+    <w:lvl w:ilvl="7" w:tentative="1">
+      <w:start w:val="1"/>
+      <w:numFmt w:val="bullet"/>
+      <w:lvlText w:val=""/>
+      <w:lvlJc w:val="left"/>
+      <w:pPr>
+        <w:tabs>
+          <w:tab w:val="num" w:pos="5760"/>
+        </w:tabs>
+        <w:ind w:left="5760" w:hanging="360"/>
+      </w:pPr>
+      <w:rPr>
+        <w:rFonts w:ascii="Wingdings" w:hAnsi="Wingdings" w:hint="default"/>
+        <w:sz w:val="20"/>
+      </w:rPr>
+    </w:lvl>
+    <w:lvl w:ilvl="8" w:tentative="1">
+      <w:start w:val="1"/>
+      <w:numFmt w:val="bullet"/>
+      <w:lvlText w:val=""/>
+      <w:lvlJc w:val="left"/>
+      <w:pPr>
+        <w:tabs>
+          <w:tab w:val="num" w:pos="6480"/>
+        </w:tabs>
+        <w:ind w:left="6480" w:hanging="360"/>
+      </w:pPr>
+      <w:rPr>
+        <w:rFonts w:ascii="Wingdings" w:hAnsi="Wingdings" w:hint="default"/>
+        <w:sz w:val="20"/>
+      </w:rPr>
+    </w:lvl>
+  </w:abstractNum>
+  <w:abstractNum w:abstractNumId="2" w15:restartNumberingAfterBreak="0">
     <w:nsid w:val="4FAC33E8"/>
     <w:multiLevelType w:val="multilevel"/>
     <w:tmpl w:val="F868467E"/>
@@ -914,7 +1204,7 @@
       </w:rPr>
     </w:lvl>
   </w:abstractNum>
-  <w:abstractNum w:abstractNumId="2" w15:restartNumberingAfterBreak="0">
+  <w:abstractNum w:abstractNumId="3" w15:restartNumberingAfterBreak="0">
     <w:nsid w:val="6ED23CE7"/>
     <w:multiLevelType w:val="multilevel"/>
     <w:tmpl w:val="61E03DC4"/>
@@ -1064,13 +1354,16 @@
     </w:lvl>
   </w:abstractNum>
   <w:num w:numId="1" w16cid:durableId="1635720592">
-    <w:abstractNumId w:val="1"/>
+    <w:abstractNumId w:val="2"/>
   </w:num>
   <w:num w:numId="2" w16cid:durableId="624196191">
     <w:abstractNumId w:val="0"/>
   </w:num>
   <w:num w:numId="3" w16cid:durableId="1770589376">
-    <w:abstractNumId w:val="2"/>
+    <w:abstractNumId w:val="3"/>
+  </w:num>
+  <w:num w:numId="4" w16cid:durableId="410388916">
+    <w:abstractNumId w:val="1"/>
   </w:num>
 </w:numbering>
 </file>

</xml_diff>

<commit_message>
Adding results endpoints to API plan
</commit_message>
<xml_diff>
--- a/docs/New Microsoft Word Document.docx
+++ b/docs/New Microsoft Word Document.docx
@@ -88,7 +88,6 @@
         <w:t>/auth/logout: Log out the current user.</w:t>
       </w:r>
     </w:p>
-    <w:p/>
     <w:p>
       <w:pPr>
         <w:rPr>
@@ -738,6 +737,99 @@
       <w:r>
         <w:tab/>
       </w:r>
+    </w:p>
+    <w:p>
+      <w:pPr>
+        <w:tabs>
+          <w:tab w:val="left" w:pos="3899"/>
+        </w:tabs>
+      </w:pPr>
+    </w:p>
+    <w:p>
+      <w:r>
+        <w:lastRenderedPageBreak/>
+        <w:t>Results</w:t>
+      </w:r>
+    </w:p>
+    <w:p>
+      <w:pPr>
+        <w:numPr>
+          <w:ilvl w:val="0"/>
+          <w:numId w:val="5"/>
+        </w:numPr>
+      </w:pPr>
+      <w:r>
+        <w:rPr>
+          <w:b/>
+          <w:bCs/>
+        </w:rPr>
+        <w:t>POST /</w:t>
+      </w:r>
+      <w:proofErr w:type="spellStart"/>
+      <w:r>
+        <w:rPr>
+          <w:b/>
+          <w:bCs/>
+        </w:rPr>
+        <w:t>api</w:t>
+      </w:r>
+      <w:proofErr w:type="spellEnd"/>
+      <w:r>
+        <w:rPr>
+          <w:b/>
+          <w:bCs/>
+        </w:rPr>
+        <w:t>/results</w:t>
+      </w:r>
+      <w:r>
+        <w:t>: Capture finish time and position for an enrolment (Organiser only).</w:t>
+      </w:r>
+    </w:p>
+    <w:p>
+      <w:pPr>
+        <w:numPr>
+          <w:ilvl w:val="0"/>
+          <w:numId w:val="5"/>
+        </w:numPr>
+      </w:pPr>
+      <w:r>
+        <w:rPr>
+          <w:b/>
+          <w:bCs/>
+        </w:rPr>
+        <w:t>GET /</w:t>
+      </w:r>
+      <w:proofErr w:type="spellStart"/>
+      <w:r>
+        <w:rPr>
+          <w:b/>
+          <w:bCs/>
+        </w:rPr>
+        <w:t>api</w:t>
+      </w:r>
+      <w:proofErr w:type="spellEnd"/>
+      <w:r>
+        <w:rPr>
+          <w:b/>
+          <w:bCs/>
+        </w:rPr>
+        <w:t>/results</w:t>
+      </w:r>
+      <w:r>
+        <w:t>: Retrieve results for the logged-in participant.</w:t>
+      </w:r>
+    </w:p>
+    <w:p>
+      <w:pPr>
+        <w:ind w:left="720"/>
+      </w:pPr>
+    </w:p>
+    <w:p>
+      <w:pPr>
+        <w:tabs>
+          <w:tab w:val="left" w:pos="3899"/>
+        </w:tabs>
+      </w:pPr>
     </w:p>
     <w:p>
       <w:pPr>
@@ -1353,6 +1445,155 @@
       </w:rPr>
     </w:lvl>
   </w:abstractNum>
+  <w:abstractNum w:abstractNumId="4" w15:restartNumberingAfterBreak="0">
+    <w:nsid w:val="725D3B24"/>
+    <w:multiLevelType w:val="multilevel"/>
+    <w:tmpl w:val="02ACCFEA"/>
+    <w:lvl w:ilvl="0">
+      <w:start w:val="1"/>
+      <w:numFmt w:val="bullet"/>
+      <w:lvlText w:val=""/>
+      <w:lvlJc w:val="left"/>
+      <w:pPr>
+        <w:tabs>
+          <w:tab w:val="num" w:pos="720"/>
+        </w:tabs>
+        <w:ind w:left="720" w:hanging="360"/>
+      </w:pPr>
+      <w:rPr>
+        <w:rFonts w:ascii="Symbol" w:hAnsi="Symbol" w:hint="default"/>
+        <w:sz w:val="20"/>
+      </w:rPr>
+    </w:lvl>
+    <w:lvl w:ilvl="1" w:tentative="1">
+      <w:start w:val="1"/>
+      <w:numFmt w:val="bullet"/>
+      <w:lvlText w:val="o"/>
+      <w:lvlJc w:val="left"/>
+      <w:pPr>
+        <w:tabs>
+          <w:tab w:val="num" w:pos="1440"/>
+        </w:tabs>
+        <w:ind w:left="1440" w:hanging="360"/>
+      </w:pPr>
+      <w:rPr>
+        <w:rFonts w:ascii="Courier New" w:hAnsi="Courier New" w:hint="default"/>
+        <w:sz w:val="20"/>
+      </w:rPr>
+    </w:lvl>
+    <w:lvl w:ilvl="2" w:tentative="1">
+      <w:start w:val="1"/>
+      <w:numFmt w:val="bullet"/>
+      <w:lvlText w:val=""/>
+      <w:lvlJc w:val="left"/>
+      <w:pPr>
+        <w:tabs>
+          <w:tab w:val="num" w:pos="2160"/>
+        </w:tabs>
+        <w:ind w:left="2160" w:hanging="360"/>
+      </w:pPr>
+      <w:rPr>
+        <w:rFonts w:ascii="Wingdings" w:hAnsi="Wingdings" w:hint="default"/>
+        <w:sz w:val="20"/>
+      </w:rPr>
+    </w:lvl>
+    <w:lvl w:ilvl="3" w:tentative="1">
+      <w:start w:val="1"/>
+      <w:numFmt w:val="bullet"/>
+      <w:lvlText w:val=""/>
+      <w:lvlJc w:val="left"/>
+      <w:pPr>
+        <w:tabs>
+          <w:tab w:val="num" w:pos="2880"/>
+        </w:tabs>
+        <w:ind w:left="2880" w:hanging="360"/>
+      </w:pPr>
+      <w:rPr>
+        <w:rFonts w:ascii="Wingdings" w:hAnsi="Wingdings" w:hint="default"/>
+        <w:sz w:val="20"/>
+      </w:rPr>
+    </w:lvl>
+    <w:lvl w:ilvl="4" w:tentative="1">
+      <w:start w:val="1"/>
+      <w:numFmt w:val="bullet"/>
+      <w:lvlText w:val=""/>
+      <w:lvlJc w:val="left"/>
+      <w:pPr>
+        <w:tabs>
+          <w:tab w:val="num" w:pos="3600"/>
+        </w:tabs>
+        <w:ind w:left="3600" w:hanging="360"/>
+      </w:pPr>
+      <w:rPr>
+        <w:rFonts w:ascii="Wingdings" w:hAnsi="Wingdings" w:hint="default"/>
+        <w:sz w:val="20"/>
+      </w:rPr>
+    </w:lvl>
+    <w:lvl w:ilvl="5" w:tentative="1">
+      <w:start w:val="1"/>
+      <w:numFmt w:val="bullet"/>
+      <w:lvlText w:val=""/>
+      <w:lvlJc w:val="left"/>
+      <w:pPr>
+        <w:tabs>
+          <w:tab w:val="num" w:pos="4320"/>
+        </w:tabs>
+        <w:ind w:left="4320" w:hanging="360"/>
+      </w:pPr>
+      <w:rPr>
+        <w:rFonts w:ascii="Wingdings" w:hAnsi="Wingdings" w:hint="default"/>
+        <w:sz w:val="20"/>
+      </w:rPr>
+    </w:lvl>
+    <w:lvl w:ilvl="6" w:tentative="1">
+      <w:start w:val="1"/>
+      <w:numFmt w:val="bullet"/>
+      <w:lvlText w:val=""/>
+      <w:lvlJc w:val="left"/>
+      <w:pPr>
+        <w:tabs>
+          <w:tab w:val="num" w:pos="5040"/>
+        </w:tabs>
+        <w:ind w:left="5040" w:hanging="360"/>
+      </w:pPr>
+      <w:rPr>
+        <w:rFonts w:ascii="Wingdings" w:hAnsi="Wingdings" w:hint="default"/>
+        <w:sz w:val="20"/>
+      </w:rPr>
+    </w:lvl>
+    <w:lvl w:ilvl="7" w:tentative="1">
+      <w:start w:val="1"/>
+      <w:numFmt w:val="bullet"/>
+      <w:lvlText w:val=""/>
+      <w:lvlJc w:val="left"/>
+      <w:pPr>
+        <w:tabs>
+          <w:tab w:val="num" w:pos="5760"/>
+        </w:tabs>
+        <w:ind w:left="5760" w:hanging="360"/>
+      </w:pPr>
+      <w:rPr>
+        <w:rFonts w:ascii="Wingdings" w:hAnsi="Wingdings" w:hint="default"/>
+        <w:sz w:val="20"/>
+      </w:rPr>
+    </w:lvl>
+    <w:lvl w:ilvl="8" w:tentative="1">
+      <w:start w:val="1"/>
+      <w:numFmt w:val="bullet"/>
+      <w:lvlText w:val=""/>
+      <w:lvlJc w:val="left"/>
+      <w:pPr>
+        <w:tabs>
+          <w:tab w:val="num" w:pos="6480"/>
+        </w:tabs>
+        <w:ind w:left="6480" w:hanging="360"/>
+      </w:pPr>
+      <w:rPr>
+        <w:rFonts w:ascii="Wingdings" w:hAnsi="Wingdings" w:hint="default"/>
+        <w:sz w:val="20"/>
+      </w:rPr>
+    </w:lvl>
+  </w:abstractNum>
   <w:num w:numId="1" w16cid:durableId="1635720592">
     <w:abstractNumId w:val="2"/>
   </w:num>
@@ -1364,6 +1605,9 @@
   </w:num>
   <w:num w:numId="4" w16cid:durableId="410388916">
     <w:abstractNumId w:val="1"/>
+  </w:num>
+  <w:num w:numId="5" w16cid:durableId="2104716408">
+    <w:abstractNumId w:val="4"/>
   </w:num>
 </w:numbering>
 </file>

</xml_diff>